<commit_message>
docs: add demo video link (bilibili BV1eqjn6xEp3), finalize all 11 delivery items
</commit_message>
<xml_diff>
--- a/AIAgent全栈工程师-交付文档-终版.docx
+++ b/AIAgent全栈工程师-交付文档-终版.docx
@@ -6515,7 +6515,7 @@
                 <w:b w:val="0"/>
                 <w:sz w:val="17"/>
               </w:rPr>
-              <w:t>⏸️</w:t>
+              <w:t>✅</w:t>
             </w:r>
           </w:p>
         </w:tc>
@@ -6535,7 +6535,7 @@
                 <w:b w:val="0"/>
                 <w:sz w:val="17"/>
               </w:rPr>
-              <w:t>录制脚本已备好 (docs/DEMO_SCRIPT.md)</w:t>
+              <w:t>https://www.bilibili.com/video/BV1eqjn6xEp3/ (5分钟，登录→Create→生成→Home→Play)</w:t>
             </w:r>
           </w:p>
         </w:tc>
@@ -9293,8 +9293,6 @@
           <w:sz w:val="17"/>
         </w:rPr>
         <w:t>• OAuth 第三方登录：文档注明 demo 阶段可不实现，role 字段已预留</w:t>
-        <w:br/>
-        <w:t>• 演示视频：录制脚本已备好</w:t>
         <w:br/>
         <w:t>• WebSocket 推送：当前轮询方案 MVP 够用，升级只需改一处</w:t>
       </w:r>

</xml_diff>